<commit_message>
Remove nasledstvo.html, update-index-github.sh; fix publish-report.sh, report-danil.html back link
</commit_message>
<xml_diff>
--- a/reports/irina-npa-weekly.docx
+++ b/reports/irina-npa-weekly.docx
@@ -7,7 +7,7 @@
         <w:pStyle w:val="Heading1"/>
       </w:pPr>
       <w:r>
-        <w:t>Еженедельный аналитический обзор НПА и новостей</w:t>
+        <w:t>Аналитический обзор нормативно-правовых актов и новостей</w:t>
       </w:r>
     </w:p>
     <w:p>
@@ -15,7 +15,15 @@
         <w:pStyle w:val="Heading2"/>
       </w:pPr>
       <w:r>
-        <w:t>Период: 8–14 июня 2026 года</w:t>
+        <w:t>Неделя: 14–20 июня 2026 г.</w:t>
+      </w:r>
+    </w:p>
+    <w:p>
+      <w:pPr>
+        <w:pStyle w:val="Heading3"/>
+      </w:pPr>
+      <w:r>
+        <w:t>Категории: инвалидность, ветераны боевых действий, участники СВО, члены их семей</w:t>
       </w:r>
     </w:p>
     <w:p>
@@ -23,15 +31,7 @@
         <w:pStyle w:val="Heading2"/>
       </w:pPr>
       <w:r>
-        <w:t>Категории: инвалиды, ветераны боевых действий, участники СВО, члены их семей</w:t>
-      </w:r>
-    </w:p>
-    <w:p>
-      <w:pPr>
-        <w:pStyle w:val="Heading2"/>
-      </w:pPr>
-      <w:r>
-        <w:t>I. ФЕДЕРАЛЬНЫЕ НПА И ИНИЦИАТИВЫ</w:t>
+        <w:t>I. ФЕДЕРАЛЬНЫЕ НПА И СОБЫТИЯ</w:t>
       </w:r>
     </w:p>
     <w:p>
@@ -39,12 +39,7 @@
         <w:pStyle w:val="Heading3"/>
       </w:pPr>
       <w:r>
-        <w:t>1. Люди с инвалидностью</w:t>
-      </w:r>
-    </w:p>
-    <w:p>
-      <w:r>
-        <w:t>#### 1.1. Законопроект о повышении штрафов за незаконную установку знака «Инвалид»</w:t>
+        <w:t>1. Указ Президента РФ — расширение категорий поддержки Фонда «Защитники Отечества»</w:t>
       </w:r>
     </w:p>
     <w:p>
@@ -59,22 +54,7 @@
         <w:t>Дата:</w:t>
       </w:r>
       <w:r>
-        <w:t xml:space="preserve"> 14 июня 2026 (публикация), внесён в Правительство РФ</w:t>
-      </w:r>
-    </w:p>
-    <w:p>
-      <w:pPr>
-        <w:pStyle w:val="ListBullet"/>
-      </w:pPr>
-      <w:r/>
-      <w:r>
-        <w:rPr>
-          <w:b/>
-        </w:rPr>
-        <w:t>Инициатор:</w:t>
-      </w:r>
-      <w:r>
-        <w:t xml:space="preserve"> группа депутатов во главе с председателем Комитета ГД по труду, социальной политике и делам ветеранов Ярославом Ниловым</w:t>
+        <w:t xml:space="preserve"> ~16 июня 2026 г.</w:t>
       </w:r>
     </w:p>
     <w:p>
@@ -89,32 +69,50 @@
         <w:t>Суть:</w:t>
       </w:r>
       <w:r>
-        <w:t xml:space="preserve"> Предлагается повысить административный штраф за незаконную установку опознавательного знака «Инвалид»:</w:t>
+        <w:t xml:space="preserve"> Президент РФ Владимир Путин подписал Указ, расширяющий круг лиц, имеющих право на поддержку государственного фонда «Защитники Отечества». Теперь помощь фонда доступна:</w:t>
       </w:r>
     </w:p>
     <w:p>
       <w:r>
-        <w:t xml:space="preserve">  - Первичное нарушение: с 5 000 до </w:t>
+        <w:t xml:space="preserve">  - </w:t>
       </w:r>
       <w:r>
         <w:rPr>
           <w:b/>
         </w:rPr>
-        <w:t>7 500 рублей</w:t>
+        <w:t>действующим военнослужащим</w:t>
       </w:r>
-      <w:r/>
+      <w:r>
+        <w:t>, получившим инвалидность в ходе выполнения боевых задач;</w:t>
+      </w:r>
     </w:p>
     <w:p>
       <w:r>
-        <w:t xml:space="preserve">  - Повторное нарушение: </w:t>
+        <w:t xml:space="preserve">  - </w:t>
       </w:r>
       <w:r>
         <w:rPr>
           <w:b/>
         </w:rPr>
-        <w:t>25 000 рублей</w:t>
+        <w:t>гражданам</w:t>
       </w:r>
-      <w:r/>
+      <w:r>
+        <w:t>, ставшим инвалидами вследствие отражения агрессии на приграничных территориях РФ;</w:t>
+      </w:r>
+    </w:p>
+    <w:p>
+      <w:r>
+        <w:t xml:space="preserve">  - </w:t>
+      </w:r>
+      <w:r>
+        <w:rPr>
+          <w:b/>
+        </w:rPr>
+        <w:t>ветеранам боевых действий</w:t>
+      </w:r>
+      <w:r>
+        <w:t>, выполнявшим задачи по отражению вооружённого вторжения.</w:t>
+      </w:r>
     </w:p>
     <w:p>
       <w:pPr>
@@ -125,10 +123,10 @@
         <w:rPr>
           <w:b/>
         </w:rPr>
-        <w:t>Обоснование:</w:t>
+        <w:t>Категории:</w:t>
       </w:r>
       <w:r>
-        <w:t xml:space="preserve"> Рост количества водителей, незаконно использующих знак для бесплатной парковки. Из-за этого инвалиды не могут найти свободные места на специализированных парковках.</w:t>
+        <w:t xml:space="preserve"> участники СВО, ветераны боевых действий, лица с инвалидностью вследствие боевых действий.</w:t>
       </w:r>
     </w:p>
     <w:p>
@@ -143,12 +141,15 @@
         <w:t>Источник:</w:t>
       </w:r>
       <w:r>
-        <w:t xml:space="preserve"> https://www.pnp.ru/social/shtrafy-za-nezakonnuyu-ustanovku-znaka-invalid-na-avto-predlozhili-povysit.html</w:t>
+        <w:t xml:space="preserve"> kirfakel.ru, irk-news.ru, admoblkaluga.ru, sakh.online и др.</w:t>
       </w:r>
     </w:p>
     <w:p>
+      <w:pPr>
+        <w:pStyle w:val="Heading3"/>
+      </w:pPr>
       <w:r>
-        <w:t>#### 1.2. Беззаявительное назначение страховой пенсии по старости (затрагивает инвалидов)</w:t>
+        <w:t>2. Совет Федерации одобрил поправки о защите иностранных граждан — участников СВО</w:t>
       </w:r>
     </w:p>
     <w:p>
@@ -163,37 +164,7 @@
         <w:t>Дата:</w:t>
       </w:r>
       <w:r>
-        <w:t xml:space="preserve"> 10 июня 2026 — Минтруд разместил проект федерального закона на портале проектов НПА</w:t>
-      </w:r>
-    </w:p>
-    <w:p>
-      <w:pPr>
-        <w:pStyle w:val="ListBullet"/>
-      </w:pPr>
-      <w:r/>
-      <w:r>
-        <w:rPr>
-          <w:b/>
-        </w:rPr>
-        <w:t>Общественное обсуждение:</w:t>
-      </w:r>
-      <w:r>
-        <w:t xml:space="preserve"> до 25 июня 2026</w:t>
-      </w:r>
-    </w:p>
-    <w:p>
-      <w:pPr>
-        <w:pStyle w:val="ListBullet"/>
-      </w:pPr>
-      <w:r/>
-      <w:r>
-        <w:rPr>
-          <w:b/>
-        </w:rPr>
-        <w:t>Планируемый срок вступления:</w:t>
-      </w:r>
-      <w:r>
-        <w:t xml:space="preserve"> 1 января 2027</w:t>
+        <w:t xml:space="preserve"> 17–20 июня 2026 г.</w:t>
       </w:r>
     </w:p>
     <w:p>
@@ -208,7 +179,41 @@
         <w:t>Суть:</w:t>
       </w:r>
       <w:r>
-        <w:t xml:space="preserve"> Социальный фонд будет назначать страховую пенсию по старости автоматически, без заявления гражданина. Информация о возрасте, стаже и ИПК уже есть в цифровых системах СФР.</w:t>
+        <w:t xml:space="preserve"> На 615-м заседании Совет Федерации одобрил поправки в ФЗ «О порядке выезда и въезда в РФ» и ФЗ «О правовом положении иностранных граждан в РФ». В отношении иностранных граждан и лиц без гражданства, проходящих/проходивших службу по контракту в ВС РФ, устанавливается </w:t>
+      </w:r>
+      <w:r>
+        <w:rPr>
+          <w:b/>
+        </w:rPr>
+        <w:t>запрет</w:t>
+      </w:r>
+      <w:r>
+        <w:t xml:space="preserve"> на:</w:t>
+      </w:r>
+    </w:p>
+    <w:p>
+      <w:r>
+        <w:t xml:space="preserve">  - депортацию и реадмиссию;</w:t>
+      </w:r>
+    </w:p>
+    <w:p>
+      <w:r>
+        <w:t xml:space="preserve">  - сокращение срока временного пребывания;</w:t>
+      </w:r>
+    </w:p>
+    <w:p>
+      <w:r>
+        <w:t xml:space="preserve">  - неразрешение въезда;</w:t>
+      </w:r>
+    </w:p>
+    <w:p>
+      <w:r>
+        <w:t xml:space="preserve">  - нежелательность пребывания;</w:t>
+      </w:r>
+    </w:p>
+    <w:p>
+      <w:r>
+        <w:t xml:space="preserve">  - отказ в выдаче/аннулирование разрешения на временное проживание, патента, разрешения на работу.</w:t>
       </w:r>
     </w:p>
     <w:p>
@@ -220,25 +225,10 @@
         <w:rPr>
           <w:b/>
         </w:rPr>
-        <w:t>Актуально для инвалидов:</w:t>
+        <w:t>Категории:</w:t>
       </w:r>
       <w:r>
-        <w:t xml:space="preserve"> механизм беззаявительного назначения уже работает для пенсий по инвалидности и пенсий по случаю потери кормильца. Новый закон распространит его на страховую пенсию по старости.</w:t>
-      </w:r>
-    </w:p>
-    <w:p>
-      <w:pPr>
-        <w:pStyle w:val="ListBullet"/>
-      </w:pPr>
-      <w:r/>
-      <w:r>
-        <w:rPr>
-          <w:b/>
-        </w:rPr>
-        <w:t>Дополнительно:</w:t>
-      </w:r>
-      <w:r>
-        <w:t xml:space="preserve"> СФР будет обязан предоставлять гражданам подробную информацию об условиях увеличения ИПК и фиксированной выплаты при отсрочке выхода на пенсию.</w:t>
+        <w:t xml:space="preserve"> участники СВО, ветераны СВО из числа иностранных граждан и лиц без гражданства.</w:t>
       </w:r>
     </w:p>
     <w:p>
@@ -253,7 +243,7 @@
         <w:t>Источник:</w:t>
       </w:r>
       <w:r>
-        <w:t xml:space="preserve"> https://www.pnp.ru/social/strakhovuyu-pensiyu-namereny-naznachat-po-novym-pravilam.html</w:t>
+        <w:t xml:space="preserve"> council.gov.ru</w:t>
       </w:r>
     </w:p>
     <w:p>
@@ -261,12 +251,7 @@
         <w:pStyle w:val="Heading3"/>
       </w:pPr>
       <w:r>
-        <w:t>2. Участники СВО, ветераны боевых действий и их семьи</w:t>
-      </w:r>
-    </w:p>
-    <w:p>
-      <w:r>
-        <w:t>#### 2.1. Обязательная геномная регистрация военнослужащих — вступление закона в силу</w:t>
+        <w:t>3. Заявление Председателя ГД В. Володина: принят 171 закон в поддержку СВО</w:t>
       </w:r>
     </w:p>
     <w:p>
@@ -281,22 +266,7 @@
         <w:t>Дата:</w:t>
       </w:r>
       <w:r>
-        <w:t xml:space="preserve"> 7 июня 2026 — вступление в силу Федерального закона от 08.03.2026 № 52-ФЗ</w:t>
-      </w:r>
-    </w:p>
-    <w:p>
-      <w:pPr>
-        <w:pStyle w:val="ListBullet"/>
-      </w:pPr>
-      <w:r/>
-      <w:r>
-        <w:rPr>
-          <w:b/>
-        </w:rPr>
-        <w:t>Дополнительно:</w:t>
-      </w:r>
-      <w:r>
-        <w:t xml:space="preserve"> 9 июня 2026 — вступление в силу постановления Правительства (подзаконный акт)</w:t>
+        <w:t xml:space="preserve"> ~16–19 июня 2026 г.</w:t>
       </w:r>
     </w:p>
     <w:p>
@@ -311,36 +281,16 @@
         <w:t>Суть:</w:t>
       </w:r>
       <w:r>
-        <w:t xml:space="preserve"> Вводится обязательная государственная геномная регистрация для:</w:t>
-      </w:r>
-    </w:p>
-    <w:p>
-      <w:r>
-        <w:t xml:space="preserve">  - Военнослужащих, направляемых для участия в боевых действиях, КТО и миротворческих операциях</w:t>
-      </w:r>
-    </w:p>
-    <w:p>
-      <w:r>
-        <w:t xml:space="preserve">  - Сотрудников Росгвардии и органов внутренних дел</w:t>
-      </w:r>
-    </w:p>
-    <w:p>
-      <w:r>
-        <w:t xml:space="preserve">  - </w:t>
+        <w:t xml:space="preserve"> В интервью телеканалу «Россия 24» Вячеслав Володин сообщил, что с 2022 года Государственной Думой принят </w:t>
       </w:r>
       <w:r>
         <w:rPr>
           <w:b/>
         </w:rPr>
-        <w:t>Гражданского персонала</w:t>
+        <w:t>171 закон</w:t>
       </w:r>
       <w:r>
-        <w:t>, обеспечивающего проведение спецоперации (дополнение от 9 июня)</w:t>
-      </w:r>
-    </w:p>
-    <w:p>
-      <w:r>
-        <w:t xml:space="preserve">  - Лиц, пребывающих в добровольческих формированиях (обязательная дактилоскопия)</w:t>
+        <w:t xml:space="preserve"> в части поддержки специальной военной операции, солдат, офицеров и членов их семей. Депутаты продолжают вносить изменения по мере необходимости.</w:t>
       </w:r>
     </w:p>
     <w:p>
@@ -352,10 +302,10 @@
         <w:rPr>
           <w:b/>
         </w:rPr>
-        <w:t>Порядок:</w:t>
+        <w:t>Категории:</w:t>
       </w:r>
       <w:r>
-        <w:t xml:space="preserve"> ДНК берётся методом соскоба слизистой оболочки рта (также могут использоваться клетки, ткани, волосы, кровь). Данные вносятся в Федеральную базу данных геномной информации.</w:t>
+        <w:t xml:space="preserve"> участники СВО, ветераны, члены семей.</w:t>
       </w:r>
     </w:p>
     <w:p>
@@ -367,55 +317,18 @@
         <w:rPr>
           <w:b/>
         </w:rPr>
-        <w:t>Срок хранения:</w:t>
+        <w:t>Источник:</w:t>
       </w:r>
       <w:r>
-        <w:t xml:space="preserve"> до достижения 100-летнего возраста либо до установления личности в случае смерти. Образцы могут быть уничтожены по письменному заявлению после увольнения.</w:t>
+        <w:t xml:space="preserve"> duma.gov.ru</w:t>
       </w:r>
     </w:p>
     <w:p>
       <w:pPr>
-        <w:pStyle w:val="ListBullet"/>
+        <w:pStyle w:val="Heading3"/>
       </w:pPr>
-      <w:r/>
       <w:r>
-        <w:rPr>
-          <w:b/>
-        </w:rPr>
-        <w:t>Цель:</w:t>
-      </w:r>
-      <w:r>
-        <w:t xml:space="preserve"> Идентификация личности раненых или погибших в условиях боевых действий. Как отметила депутат Т. Кусайко, в условиях СВО это позволит ускорить процесс опознания и снизить неопределённость для родственников.</w:t>
-      </w:r>
-    </w:p>
-    <w:p>
-      <w:pPr>
-        <w:pStyle w:val="ListBullet"/>
-      </w:pPr>
-      <w:r/>
-      <w:r>
-        <w:rPr>
-          <w:b/>
-        </w:rPr>
-        <w:t>Источники:</w:t>
-      </w:r>
-      <w:r>
-        <w:t xml:space="preserve"> </w:t>
-      </w:r>
-    </w:p>
-    <w:p>
-      <w:r>
-        <w:t xml:space="preserve">  - https://www.pnp.ru/social/v-rossii-vvoditsya-genomnaya-registraciya-voennykh.html</w:t>
-      </w:r>
-    </w:p>
-    <w:p>
-      <w:r>
-        <w:t xml:space="preserve">  - https://www.pnp.ru/social/genomnuyu-registraciyu-proydut-ne-tolko-voennye-no-i-grazhdanskie-sotrudniki.html</w:t>
-      </w:r>
-    </w:p>
-    <w:p>
-      <w:r>
-        <w:t>#### 2.2. Приоритетное зачисление детей Героев России в детские сады и школы</w:t>
+        <w:t>4. СФР: продление срока действия документов об инвалидности для граждан из новых субъектов</w:t>
       </w:r>
     </w:p>
     <w:p>
@@ -430,22 +343,7 @@
         <w:t>Дата:</w:t>
       </w:r>
       <w:r>
-        <w:t xml:space="preserve"> 10 июня 2026 — принят в первом чтении Госдумой</w:t>
-      </w:r>
-    </w:p>
-    <w:p>
-      <w:pPr>
-        <w:pStyle w:val="ListBullet"/>
-      </w:pPr>
-      <w:r/>
-      <w:r>
-        <w:rPr>
-          <w:b/>
-        </w:rPr>
-        <w:t>Инициатор:</w:t>
-      </w:r>
-      <w:r>
-        <w:t xml:space="preserve"> Брянская областная дума</w:t>
+        <w:t xml:space="preserve"> 21 июня 2026 г. (публикация)</w:t>
       </w:r>
     </w:p>
     <w:p>
@@ -460,17 +358,34 @@
         <w:t>Суть:</w:t>
       </w:r>
       <w:r>
-        <w:t xml:space="preserve"> Законопроект предоставляет детям Героев России и полных кавалеров ордена Славы право на </w:t>
+        <w:t xml:space="preserve"> Отделение СФР по Астраханской области (в развитие изменений в ст. 12 ФЗ № 18-ФЗ от 17.02.2023) актуализировало памятку о продлении срока действия документов об установлении инвалидности, выданных на территории ДНР, ЛНР, Запорожской, Херсонской областей или Украины:</w:t>
+      </w:r>
+    </w:p>
+    <w:p>
+      <w:r>
+        <w:t xml:space="preserve">  - документы со сроком, истекающим (истекшим) в период с 24.02.2022 до 31.12.2026 — </w:t>
       </w:r>
       <w:r>
         <w:rPr>
           <w:b/>
         </w:rPr>
-        <w:t>первоочередной приём</w:t>
+        <w:t>продлены до 31 декабря 2026 г.</w:t>
       </w:r>
       <w:r>
-        <w:t xml:space="preserve"> в государственные и муниципальные детские сады и школы по месту жительства.</w:t>
+        <w:t>;</w:t>
       </w:r>
+    </w:p>
+    <w:p>
+      <w:r>
+        <w:t xml:space="preserve">  - документы без указания срока, выданные до 1 марта 2023 г. — </w:t>
+      </w:r>
+      <w:r>
+        <w:rPr>
+          <w:b/>
+        </w:rPr>
+        <w:t>продлены до 1 января 2028 г.</w:t>
+      </w:r>
+      <w:r/>
     </w:p>
     <w:p>
       <w:pPr>
@@ -481,34 +396,10 @@
         <w:rPr>
           <w:b/>
         </w:rPr>
-        <w:t>В случае гибели Героя:</w:t>
+        <w:t>Категории:</w:t>
       </w:r>
       <w:r>
-        <w:t xml:space="preserve"> ребёнок принимается </w:t>
-      </w:r>
-      <w:r>
-        <w:rPr>
-          <w:b/>
-        </w:rPr>
-        <w:t>вне очереди</w:t>
-      </w:r>
-      <w:r>
-        <w:t>, независимо от наличия свободных мест.</w:t>
-      </w:r>
-    </w:p>
-    <w:p>
-      <w:pPr>
-        <w:pStyle w:val="ListBullet"/>
-      </w:pPr>
-      <w:r/>
-      <w:r>
-        <w:rPr>
-          <w:b/>
-        </w:rPr>
-        <w:t>Актуальность:</w:t>
-      </w:r>
-      <w:r>
-        <w:t xml:space="preserve"> Ранее льгота существовала для детей военнослужащих и добровольцев, но не распространялась на детей Героев России. Законопроект устраняет этот пробел.</w:t>
+        <w:t xml:space="preserve"> лица с инвалидностью из новых субъектов РФ.</w:t>
       </w:r>
     </w:p>
     <w:p>
@@ -523,12 +414,15 @@
         <w:t>Источник:</w:t>
       </w:r>
       <w:r>
-        <w:t xml:space="preserve"> https://www.pnp.ru/social/detey-geroev-rossii-zachislyat-v-sad-bez-ocheredi.html</w:t>
+        <w:t xml:space="preserve"> sfr.gov.ru</w:t>
       </w:r>
     </w:p>
     <w:p>
+      <w:pPr>
+        <w:pStyle w:val="Heading3"/>
+      </w:pPr>
       <w:r>
-        <w:t>#### 2.3. Бесплатное подключение к электросетям для фермеров — участников СВО</w:t>
+        <w:t>5. Социальный фонд России: 28 мер поддержки ветеранов СВО и их семей</w:t>
       </w:r>
     </w:p>
     <w:p>
@@ -543,22 +437,7 @@
         <w:t>Дата:</w:t>
       </w:r>
       <w:r>
-        <w:t xml:space="preserve"> первая половина июня 2026 (обращение в Минэнерго)</w:t>
-      </w:r>
-    </w:p>
-    <w:p>
-      <w:pPr>
-        <w:pStyle w:val="ListBullet"/>
-      </w:pPr>
-      <w:r/>
-      <w:r>
-        <w:rPr>
-          <w:b/>
-        </w:rPr>
-        <w:t>Инициатор:</w:t>
-      </w:r>
-      <w:r>
-        <w:t xml:space="preserve"> Ассоциация сельскохозяйственных товаропроизводителей «Народный фермер»</w:t>
+        <w:t xml:space="preserve"> ~18–20 июня 2026 г.</w:t>
       </w:r>
     </w:p>
     <w:p>
@@ -573,7 +452,7 @@
         <w:t>Суть:</w:t>
       </w:r>
       <w:r>
-        <w:t xml:space="preserve"> Ассоциация направила письмо в Минэнерго с просьбой установить для ветеранов СВО, осуществляющих деятельность в сельском хозяйстве, право на:</w:t>
+        <w:t xml:space="preserve"> СФР опубликовал перечень мер поддержки:</w:t>
       </w:r>
     </w:p>
     <w:p>
@@ -584,10 +463,10 @@
         <w:rPr>
           <w:b/>
         </w:rPr>
-        <w:t>Бесплатное технологическое присоединение</w:t>
+        <w:t>Для ветеранов (18 мер):</w:t>
       </w:r>
       <w:r>
-        <w:t xml:space="preserve"> к электрическим сетям</w:t>
+        <w:t xml:space="preserve"> ЕДВ ветеранам боевых действий, ежемесячная выплата Героям России, компенсация набора социальных услуг (НСУ), санаторно-курортное лечение и реабилитация в центрах СФР, ежемесячная компенсация по военной травме, дополнительное материальное обеспечение по военной травме, проактивное оформление электронного сертификата на ТСР.</w:t>
       </w:r>
     </w:p>
     <w:p>
@@ -598,10 +477,24 @@
         <w:rPr>
           <w:b/>
         </w:rPr>
-        <w:t>Специальный сниженный тариф</w:t>
+        <w:t>Для семей (10 мер):</w:t>
       </w:r>
       <w:r>
-        <w:t xml:space="preserve"> на электроэнергию</w:t>
+        <w:t xml:space="preserve"> единое пособие без учёта доходов мобилизованного, единовременная выплата беременной жене мобилизованного, ежемесячное пособие на ребёнка мобилизованного, льготное оформление пособия на первого ребёнка до 3 лет.</w:t>
+      </w:r>
+    </w:p>
+    <w:p>
+      <w:r>
+        <w:t xml:space="preserve">  - </w:t>
+      </w:r>
+      <w:r>
+        <w:rPr>
+          <w:b/>
+        </w:rPr>
+        <w:t>Пенсионные льготы:</w:t>
+      </w:r>
+      <w:r>
+        <w:t xml:space="preserve"> период участия в СВО засчитывается в удвоенном размере (2 года стажа за 1 год), +3,6 пенсионного коэффициента. Ветераны имеют право на две пенсии одновременно (страховая по старости + государственная по инвалидности).</w:t>
       </w:r>
     </w:p>
     <w:p>
@@ -613,25 +506,10 @@
         <w:rPr>
           <w:b/>
         </w:rPr>
-        <w:t>Контекст:</w:t>
+        <w:t>Категории:</w:t>
       </w:r>
       <w:r>
-        <w:t xml:space="preserve"> Доля затрат на электричество в себестоимости сельхозпроизводства — до 40%. Тариф для фермеров — ~10 руб./кВт·ч, для промышленности — ~5 руб./кВт·ч. Льготы на техприсоединение отменены в 2022 году.</w:t>
-      </w:r>
-    </w:p>
-    <w:p>
-      <w:pPr>
-        <w:pStyle w:val="ListBullet"/>
-      </w:pPr>
-      <w:r/>
-      <w:r>
-        <w:rPr>
-          <w:b/>
-        </w:rPr>
-        <w:t>Предложение депутата К. Панеш:</w:t>
-      </w:r>
-      <w:r>
-        <w:t xml:space="preserve"> Установить плату за присоединение до 150 кВт не более 5 000 руб. (вместо 500–800 тыс. руб.), а на первые 5 лет — тариф 1–2 руб./кВт·ч.</w:t>
+        <w:t xml:space="preserve"> ветераны СВО, члены семей.</w:t>
       </w:r>
     </w:p>
     <w:p>
@@ -646,12 +524,28 @@
         <w:t>Источник:</w:t>
       </w:r>
       <w:r>
-        <w:t xml:space="preserve"> https://www.pnp.ru/economics/minenergo-poprosili-besplatno-podklyuchit-k-elektrosetyam-agrariev-uchastnikov-svo.html</w:t>
+        <w:t xml:space="preserve"> ptzgovorit.ru (со ссылкой на СФР)</w:t>
+      </w:r>
+    </w:p>
+    <w:p>
+      <w:pPr>
+        <w:pStyle w:val="Heading2"/>
+      </w:pPr>
+      <w:r>
+        <w:t>II. РЕГИОНАЛЬНЫЕ НПА</w:t>
+      </w:r>
+    </w:p>
+    <w:p>
+      <w:pPr>
+        <w:pStyle w:val="Heading3"/>
+      </w:pPr>
+      <w:r>
+        <w:t>г. Санкт-Петербург</w:t>
       </w:r>
     </w:p>
     <w:p>
       <w:r>
-        <w:t>#### 2.4. Фонд «Защитники Отечества» — центры духовно-психологической реабилитации</w:t>
+        <w:t>#### 6. Законопроект о выплатах безработным ветеранам СВО на открытие бизнеса</w:t>
       </w:r>
     </w:p>
     <w:p>
@@ -666,7 +560,7 @@
         <w:t>Дата:</w:t>
       </w:r>
       <w:r>
-        <w:t xml:space="preserve"> 5 июня 2026 — публикация на полях ПМЭФ-2026</w:t>
+        <w:t xml:space="preserve"> ~16–19 июня 2026 г. (первое чтение)</w:t>
       </w:r>
     </w:p>
     <w:p>
@@ -678,10 +572,52 @@
         <w:rPr>
           <w:b/>
         </w:rPr>
-        <w:t>Спикер:</w:t>
+        <w:t>Суть:</w:t>
       </w:r>
       <w:r>
-        <w:t xml:space="preserve"> Анна Цивилева (статс-секретарь — замминистра обороны РФ, председатель фонда «Защитники Отечества»)</w:t>
+        <w:t xml:space="preserve"> Законодательное собрание Санкт-Петербурга в первом чтении одобрило законопроект:</w:t>
+      </w:r>
+    </w:p>
+    <w:p>
+      <w:r>
+        <w:t xml:space="preserve">  - </w:t>
+      </w:r>
+      <w:r>
+        <w:rPr>
+          <w:b/>
+        </w:rPr>
+        <w:t>до 350 000 рублей</w:t>
+      </w:r>
+      <w:r>
+        <w:t xml:space="preserve"> безработным участникам СВО на открытие бизнеса по социальному контракту;</w:t>
+      </w:r>
+    </w:p>
+    <w:p>
+      <w:r>
+        <w:t xml:space="preserve">  - оценка материального положения семьи </w:t>
+      </w:r>
+      <w:r>
+        <w:rPr>
+          <w:b/>
+        </w:rPr>
+        <w:t>не требуется</w:t>
+      </w:r>
+      <w:r>
+        <w:t>;</w:t>
+      </w:r>
+    </w:p>
+    <w:p>
+      <w:r>
+        <w:t xml:space="preserve">  - мера распространяется также на </w:t>
+      </w:r>
+      <w:r>
+        <w:rPr>
+          <w:b/>
+        </w:rPr>
+        <w:t>супругов</w:t>
+      </w:r>
+      <w:r>
+        <w:t xml:space="preserve"> военнослужащих, получивших инвалидность I и II группы.</w:t>
       </w:r>
     </w:p>
     <w:p>
@@ -693,76 +629,25 @@
         <w:rPr>
           <w:b/>
         </w:rPr>
-        <w:t>Ключевые результаты работы фонда:</w:t>
+        <w:t>Также утверждён</w:t>
       </w:r>
-      <w:r/>
-    </w:p>
-    <w:p>
       <w:r>
-        <w:t xml:space="preserve">  - С 2025 года работает Паломнический центр при Псково-Печерском монастыре (более 300 человек прошли реабилитацию, к концу 2026 — ~600)</w:t>
+        <w:t xml:space="preserve"> закон о бесплатной юридической помощи беженцам, вынужденным переселенцам.</w:t>
       </w:r>
     </w:p>
     <w:p>
-      <w:r>
-        <w:t xml:space="preserve">  - В 2026 году планируется открытие центров в </w:t>
-      </w:r>
+      <w:pPr>
+        <w:pStyle w:val="ListBullet"/>
+      </w:pPr>
+      <w:r/>
       <w:r>
         <w:rPr>
           <w:b/>
         </w:rPr>
-        <w:t>Херсонесе</w:t>
+        <w:t>Категории:</w:t>
       </w:r>
       <w:r>
-        <w:t xml:space="preserve"> и </w:t>
-      </w:r>
-      <w:r>
-        <w:rPr>
-          <w:b/>
-        </w:rPr>
-        <w:t>Самарской области</w:t>
-      </w:r>
-      <w:r>
-        <w:t xml:space="preserve">, в 2027 — в </w:t>
-      </w:r>
-      <w:r>
-        <w:rPr>
-          <w:b/>
-        </w:rPr>
-        <w:t>Ростове Великом</w:t>
-      </w:r>
-      <w:r/>
-    </w:p>
-    <w:p>
-      <w:r>
-        <w:t xml:space="preserve">  - В 2025 году более </w:t>
-      </w:r>
-      <w:r>
-        <w:rPr>
-          <w:b/>
-        </w:rPr>
-        <w:t>15 000 человек</w:t>
-      </w:r>
-      <w:r>
-        <w:t xml:space="preserve"> — участники паломнических поездок</w:t>
-      </w:r>
-    </w:p>
-    <w:p>
-      <w:r>
-        <w:t xml:space="preserve">  - Более </w:t>
-      </w:r>
-      <w:r>
-        <w:rPr>
-          <w:b/>
-        </w:rPr>
-        <w:t>1 500 человек</w:t>
-      </w:r>
-      <w:r>
-        <w:t xml:space="preserve"> совершили хадж в Мекку</w:t>
-      </w:r>
-    </w:p>
-    <w:p>
-      <w:r>
-        <w:t xml:space="preserve">  - Программа паломнических поездок расширена в 2026 году на каждый федеральный округ</w:t>
+        <w:t xml:space="preserve"> участники СВО, ветераны, супруги военнослужащих с инвалидностью I–II гр.</w:t>
       </w:r>
     </w:p>
     <w:p>
@@ -777,7 +662,7 @@
         <w:t>Источник:</w:t>
       </w:r>
       <w:r>
-        <w:t xml:space="preserve"> https://www.pnp.ru/social/anna-civileva-rasskazala-kak-veteranam-svo-pomogayut-vernutsya-k-mirnoy-zhizni.html</w:t>
+        <w:t xml:space="preserve"> argumenti.ru</w:t>
       </w:r>
     </w:p>
     <w:p>
@@ -785,12 +670,12 @@
         <w:pStyle w:val="Heading3"/>
       </w:pPr>
       <w:r>
-        <w:t>3. Меры поддержки семей с детьми (смежная категория)</w:t>
+        <w:t>Ленинградская область</w:t>
       </w:r>
     </w:p>
     <w:p>
       <w:r>
-        <w:t>#### 3.1. Утверждение единых требований к авиаперевозкам для семей с детьми</w:t>
+        <w:t>#### 7. Кластер комплексного сопровождения и реабилитации во Всеволожске</w:t>
       </w:r>
     </w:p>
     <w:p>
@@ -805,7 +690,7 @@
         <w:t>Дата:</w:t>
       </w:r>
       <w:r>
-        <w:t xml:space="preserve"> 1–10 июня 2026 — заседание Совета по развитию транспортного комплекса в СФ</w:t>
+        <w:t xml:space="preserve"> 18 июня 2026 г. (в контексте Указа Президента)</w:t>
       </w:r>
     </w:p>
     <w:p>
@@ -820,16 +705,7 @@
         <w:t>Суть:</w:t>
       </w:r>
       <w:r>
-        <w:t xml:space="preserve"> Сенаторы (Андрей Кутепов) предложили утвердить </w:t>
-      </w:r>
-      <w:r>
-        <w:rPr>
-          <w:b/>
-        </w:rPr>
-        <w:t>единые минимальные требования</w:t>
-      </w:r>
-      <w:r>
-        <w:t xml:space="preserve"> к авиакомпаниям и аэропортам по сопровождению и поддержке семей с детьми. Сейчас действуют только методические рекомендации Минтранса (с конца 2025).</w:t>
+        <w:t xml:space="preserve"> Губернатор ЛО Александр Дрозденко сообщил о работе Кластера комплексного сопровождения и реабилитации участников СВО во Всеволожске. Центр предоставляет: профпереобучение, содействие в трудоустройстве, реабилитацию, высокотехнологичное протезирование.</w:t>
       </w:r>
     </w:p>
     <w:p>
@@ -841,28 +717,10 @@
         <w:rPr>
           <w:b/>
         </w:rPr>
-        <w:t>Меры, предлагаемые к закреплению:</w:t>
+        <w:t>Результаты 2026 г.:</w:t>
       </w:r>
-      <w:r/>
-    </w:p>
-    <w:p>
       <w:r>
-        <w:t xml:space="preserve">  - Выделенные парковочные места</w:t>
-      </w:r>
-    </w:p>
-    <w:p>
-      <w:r>
-        <w:t xml:space="preserve">  - Обучение персонала работе с детьми</w:t>
-      </w:r>
-    </w:p>
-    <w:p>
-      <w:r>
-        <w:t xml:space="preserve">  - Специальные кресла в транспорте</w:t>
-      </w:r>
-    </w:p>
-    <w:p>
-      <w:r>
-        <w:t xml:space="preserve">  - Игровые зоны</w:t>
+        <w:t xml:space="preserve"> более 700 подопечных прошли реабилитацию, свыше 84% обратившихся за трудоустройством нашли работу.</w:t>
       </w:r>
     </w:p>
     <w:p>
@@ -874,23 +732,10 @@
         <w:rPr>
           <w:b/>
         </w:rPr>
-        <w:t>Новые инициативы Минтранса:</w:t>
+        <w:t>Категории:</w:t>
       </w:r>
-      <w:r/>
-    </w:p>
-    <w:p>
       <w:r>
-        <w:t xml:space="preserve">  - Специальный дорожный знак для парковки многодетных семей</w:t>
-      </w:r>
-    </w:p>
-    <w:p>
-      <w:r>
-        <w:t xml:space="preserve">  - Бесплатная парковка для двух автомобилей в семьях с 4+ детьми</w:t>
-      </w:r>
-    </w:p>
-    <w:p>
-      <w:r>
-        <w:t xml:space="preserve">  - Эксперимент со скидочными промокодами на такси для многодетных</w:t>
+        <w:t xml:space="preserve"> участники СВО, ветераны.</w:t>
       </w:r>
     </w:p>
     <w:p>
@@ -905,144 +750,7 @@
         <w:t>Источник:</w:t>
       </w:r>
       <w:r>
-        <w:t xml:space="preserve"> https://www.pnp.ru/social/aviaperelety-khotyat-sdelat-komfortnee-dlya-mnogodetnykh-semey.html</w:t>
-      </w:r>
-    </w:p>
-    <w:p>
-      <w:pPr>
-        <w:pStyle w:val="Heading3"/>
-      </w:pPr>
-      <w:r>
-        <w:t>4. Законы, вступающие в силу в июне 2026 (релевантные для целевых категорий)</w:t>
-      </w:r>
-    </w:p>
-    <w:p>
-      <w:r>
-        <w:t>#### 4.1. Изменения в законодательстве о геномной регистрации</w:t>
-      </w:r>
-    </w:p>
-    <w:p>
-      <w:pPr>
-        <w:pStyle w:val="ListBullet"/>
-      </w:pPr>
-      <w:r/>
-      <w:r>
-        <w:rPr>
-          <w:b/>
-        </w:rPr>
-        <w:t>Дата вступления:</w:t>
-      </w:r>
-      <w:r>
-        <w:t xml:space="preserve"> 7 июня 2026</w:t>
-      </w:r>
-    </w:p>
-    <w:p>
-      <w:pPr>
-        <w:pStyle w:val="ListBullet"/>
-      </w:pPr>
-      <w:r/>
-      <w:r>
-        <w:rPr>
-          <w:b/>
-        </w:rPr>
-        <w:t>Закон:</w:t>
-      </w:r>
-      <w:r>
-        <w:t xml:space="preserve"> от 08.03.2026 № 52-ФЗ</w:t>
-      </w:r>
-    </w:p>
-    <w:p>
-      <w:pPr>
-        <w:pStyle w:val="ListBullet"/>
-      </w:pPr>
-      <w:r>
-        <w:t>(подробно описано в п. 2.1)</w:t>
-      </w:r>
-    </w:p>
-    <w:p>
-      <w:r>
-        <w:t>#### 4.2. Сроки передачи невостребованных авто в собственность государства</w:t>
-      </w:r>
-    </w:p>
-    <w:p>
-      <w:pPr>
-        <w:pStyle w:val="ListBullet"/>
-      </w:pPr>
-      <w:r/>
-      <w:r>
-        <w:rPr>
-          <w:b/>
-        </w:rPr>
-        <w:t>Дата вступления:</w:t>
-      </w:r>
-      <w:r>
-        <w:t xml:space="preserve"> 22 июня 2026</w:t>
-      </w:r>
-    </w:p>
-    <w:p>
-      <w:pPr>
-        <w:pStyle w:val="ListBullet"/>
-      </w:pPr>
-      <w:r/>
-      <w:r>
-        <w:rPr>
-          <w:b/>
-        </w:rPr>
-        <w:t>Закон:</w:t>
-      </w:r>
-      <w:r>
-        <w:t xml:space="preserve"> от 23.03.2026 № 61-ФЗ</w:t>
-      </w:r>
-    </w:p>
-    <w:p>
-      <w:pPr>
-        <w:pStyle w:val="ListBullet"/>
-      </w:pPr>
-      <w:r>
-        <w:t>Сроки публикации сведений на сайте ФТС сокращаются с 60 до 30 дней</w:t>
-      </w:r>
-    </w:p>
-    <w:p>
-      <w:r>
-        <w:t>#### 4.3. Запрет перевода осуждённых за экстремизм ближе к родственникам</w:t>
-      </w:r>
-    </w:p>
-    <w:p>
-      <w:pPr>
-        <w:pStyle w:val="ListBullet"/>
-      </w:pPr>
-      <w:r/>
-      <w:r>
-        <w:rPr>
-          <w:b/>
-        </w:rPr>
-        <w:t>Дата вступления:</w:t>
-      </w:r>
-      <w:r>
-        <w:t xml:space="preserve"> 28 июня 2026</w:t>
-      </w:r>
-    </w:p>
-    <w:p>
-      <w:pPr>
-        <w:pStyle w:val="ListBullet"/>
-      </w:pPr>
-      <w:r/>
-      <w:r>
-        <w:rPr>
-          <w:b/>
-        </w:rPr>
-        <w:t>Закон:</w:t>
-      </w:r>
-      <w:r>
-        <w:t xml:space="preserve"> от 29.12.2025 № 537-ФЗ</w:t>
-      </w:r>
-    </w:p>
-    <w:p>
-      <w:pPr>
-        <w:pStyle w:val="ListBullet"/>
-      </w:pPr>
-      <w:r>
-        <w:t>Запрет на перевод в ИУ ближе к месту проживания родственников для экстремистов, иностранцев и лиц без гражданства</w:t>
+        <w:t xml:space="preserve"> kirfakel.ru</w:t>
       </w:r>
     </w:p>
     <w:p>
@@ -1050,317 +758,7 @@
         <w:pStyle w:val="Heading2"/>
       </w:pPr>
       <w:r>
-        <w:t>II. РЕГИОНАЛЬНЫЕ НПА И ИНИЦИАТИВЫ</w:t>
-      </w:r>
-    </w:p>
-    <w:p>
-      <w:r>
-        <w:t xml:space="preserve">&gt; </w:t>
-      </w:r>
-      <w:r>
-        <w:rPr>
-          <w:b/>
-        </w:rPr>
-        <w:t>Примечание:</w:t>
-      </w:r>
-      <w:r>
-        <w:t xml:space="preserve"> В ходе анализа источников за 8–14 июня 2026 года через доступные каналы (Парламентская газета, официальные публикаторы) были выявлены следующие региональные инициативы, имеющие отношение к социальной поддержке целевых категорий. Ввиду ограниченной доступности поиска по региональным НПА рекомендуются дополнительные мониторинги официальных порталов субъектов РФ.</w:t>
-      </w:r>
-    </w:p>
-    <w:p>
-      <w:pPr>
-        <w:pStyle w:val="Heading3"/>
-      </w:pPr>
-      <w:r>
-        <w:t>1. Брянская область</w:t>
-      </w:r>
-    </w:p>
-    <w:p>
-      <w:pPr>
-        <w:pStyle w:val="ListBullet"/>
-      </w:pPr>
-      <w:r/>
-      <w:r>
-        <w:rPr>
-          <w:b/>
-        </w:rPr>
-        <w:t>Инициатива:</w:t>
-      </w:r>
-      <w:r>
-        <w:t xml:space="preserve"> Законопроект о приоритетном зачислении детей Героев России в детские сады и школы (внесён Брянской областной думой)</w:t>
-      </w:r>
-    </w:p>
-    <w:p>
-      <w:pPr>
-        <w:pStyle w:val="ListBullet"/>
-      </w:pPr>
-      <w:r/>
-      <w:r>
-        <w:rPr>
-          <w:b/>
-        </w:rPr>
-        <w:t>Дата:</w:t>
-      </w:r>
-      <w:r>
-        <w:t xml:space="preserve"> принят Госдумой в I чтении 10 июня 2026</w:t>
-      </w:r>
-    </w:p>
-    <w:p>
-      <w:pPr>
-        <w:pStyle w:val="ListBullet"/>
-      </w:pPr>
-      <w:r/>
-      <w:r>
-        <w:rPr>
-          <w:b/>
-        </w:rPr>
-        <w:t>Категория:</w:t>
-      </w:r>
-      <w:r>
-        <w:t xml:space="preserve"> члены семей участников СВО (Герои России)</w:t>
-      </w:r>
-    </w:p>
-    <w:p>
-      <w:pPr>
-        <w:pStyle w:val="ListBullet"/>
-      </w:pPr>
-      <w:r/>
-      <w:r>
-        <w:rPr>
-          <w:b/>
-        </w:rPr>
-        <w:t>Подробно:</w:t>
-      </w:r>
-      <w:r>
-        <w:t xml:space="preserve"> см. раздел I, п. 2.2</w:t>
-      </w:r>
-    </w:p>
-    <w:p>
-      <w:pPr>
-        <w:pStyle w:val="ListBullet"/>
-      </w:pPr>
-      <w:r/>
-      <w:r>
-        <w:rPr>
-          <w:b/>
-        </w:rPr>
-        <w:t>Источник:</w:t>
-      </w:r>
-      <w:r>
-        <w:t xml:space="preserve"> https://www.pnp.ru/social/detey-geroev-rossii-zachislyat-v-sad-bez-ocheredi.html</w:t>
-      </w:r>
-    </w:p>
-    <w:p>
-      <w:pPr>
-        <w:pStyle w:val="Heading3"/>
-      </w:pPr>
-      <w:r>
-        <w:t>2. Удмуртская Республика</w:t>
-      </w:r>
-    </w:p>
-    <w:p>
-      <w:pPr>
-        <w:pStyle w:val="ListBullet"/>
-      </w:pPr>
-      <w:r/>
-      <w:r>
-        <w:rPr>
-          <w:b/>
-        </w:rPr>
-        <w:t>Контекст:</w:t>
-      </w:r>
-      <w:r>
-        <w:t xml:space="preserve"> В материале о проблемах фермеров-участников СВО фигурирует сельхозпредприятие из Удмуртии (Денис Олин). Региональный аспект проблемы: высокие тарифы на электроэнергию (до 10 руб./кВт·ч) делают невозможным рентабельное ведение хозяйства.</w:t>
-      </w:r>
-    </w:p>
-    <w:p>
-      <w:pPr>
-        <w:pStyle w:val="ListBullet"/>
-      </w:pPr>
-      <w:r/>
-      <w:r>
-        <w:rPr>
-          <w:b/>
-        </w:rPr>
-        <w:t>Категория:</w:t>
-      </w:r>
-      <w:r>
-        <w:t xml:space="preserve"> участники СВО, ветераны боевых действий</w:t>
-      </w:r>
-    </w:p>
-    <w:p>
-      <w:pPr>
-        <w:pStyle w:val="ListBullet"/>
-      </w:pPr>
-      <w:r/>
-      <w:r>
-        <w:rPr>
-          <w:b/>
-        </w:rPr>
-        <w:t>Источник:</w:t>
-      </w:r>
-      <w:r>
-        <w:t xml:space="preserve"> https://www.pnp.ru/economics/minenergo-poprosili-besplatno-podklyuchit-k-elektrosetyam-agrariev-uchastnikov-svo.html</w:t>
-      </w:r>
-    </w:p>
-    <w:p>
-      <w:pPr>
-        <w:pStyle w:val="Heading3"/>
-      </w:pPr>
-      <w:r>
-        <w:t>3. Самарская область</w:t>
-      </w:r>
-    </w:p>
-    <w:p>
-      <w:pPr>
-        <w:pStyle w:val="ListBullet"/>
-      </w:pPr>
-      <w:r/>
-      <w:r>
-        <w:rPr>
-          <w:b/>
-        </w:rPr>
-        <w:t>Инициатива:</w:t>
-      </w:r>
-      <w:r>
-        <w:t xml:space="preserve"> Фонд «Защитники Отечества» — открытие центра духовно-психологической реабилитации для участников СВО и членов их семей (2026 год)</w:t>
-      </w:r>
-    </w:p>
-    <w:p>
-      <w:pPr>
-        <w:pStyle w:val="ListBullet"/>
-      </w:pPr>
-      <w:r/>
-      <w:r>
-        <w:rPr>
-          <w:b/>
-        </w:rPr>
-        <w:t>Категория:</w:t>
-      </w:r>
-      <w:r>
-        <w:t xml:space="preserve"> ветераны СВО, члены семей</w:t>
-      </w:r>
-    </w:p>
-    <w:p>
-      <w:pPr>
-        <w:pStyle w:val="ListBullet"/>
-      </w:pPr>
-      <w:r/>
-      <w:r>
-        <w:rPr>
-          <w:b/>
-        </w:rPr>
-        <w:t>Источник:</w:t>
-      </w:r>
-      <w:r>
-        <w:t xml:space="preserve"> https://www.pnp.ru/social/anna-civileva-rasskazala-kak-veteranam-svo-pomogayut-vernutsya-k-mirnoy-zhizni.html</w:t>
-      </w:r>
-    </w:p>
-    <w:p>
-      <w:pPr>
-        <w:pStyle w:val="Heading3"/>
-      </w:pPr>
-      <w:r>
-        <w:t>4. Севастополь (Херсонес)</w:t>
-      </w:r>
-    </w:p>
-    <w:p>
-      <w:pPr>
-        <w:pStyle w:val="ListBullet"/>
-      </w:pPr>
-      <w:r/>
-      <w:r>
-        <w:rPr>
-          <w:b/>
-        </w:rPr>
-        <w:t>Инициатива:</w:t>
-      </w:r>
-      <w:r>
-        <w:t xml:space="preserve"> Открытие центра духовно-психологической реабилитации для участников СВО (2026 год)</w:t>
-      </w:r>
-    </w:p>
-    <w:p>
-      <w:pPr>
-        <w:pStyle w:val="ListBullet"/>
-      </w:pPr>
-      <w:r/>
-      <w:r>
-        <w:rPr>
-          <w:b/>
-        </w:rPr>
-        <w:t>Категория:</w:t>
-      </w:r>
-      <w:r>
-        <w:t xml:space="preserve"> ветераны СВО, члены семей</w:t>
-      </w:r>
-    </w:p>
-    <w:p>
-      <w:pPr>
-        <w:pStyle w:val="Heading3"/>
-      </w:pPr>
-      <w:r>
-        <w:t>5. Ростовская область (Ростов Великий)</w:t>
-      </w:r>
-    </w:p>
-    <w:p>
-      <w:pPr>
-        <w:pStyle w:val="ListBullet"/>
-      </w:pPr>
-      <w:r/>
-      <w:r>
-        <w:rPr>
-          <w:b/>
-        </w:rPr>
-        <w:t>Инициатива:</w:t>
-      </w:r>
-      <w:r>
-        <w:t xml:space="preserve"> Открытие центра духовно-психологической реабилитации (планируется на 2027 год)</w:t>
-      </w:r>
-    </w:p>
-    <w:p>
-      <w:pPr>
-        <w:pStyle w:val="Heading3"/>
-      </w:pPr>
-      <w:r>
-        <w:t>6. Псковская область</w:t>
-      </w:r>
-    </w:p>
-    <w:p>
-      <w:pPr>
-        <w:pStyle w:val="ListBullet"/>
-      </w:pPr>
-      <w:r/>
-      <w:r>
-        <w:rPr>
-          <w:b/>
-        </w:rPr>
-        <w:t>Действующий объект:</w:t>
-      </w:r>
-      <w:r>
-        <w:t xml:space="preserve"> Паломнический центр для участников СВО и членов их семей в Свято-Успенском Псково-Печерском монастыре (работает с 2025 года)</w:t>
-      </w:r>
-    </w:p>
-    <w:p>
-      <w:pPr>
-        <w:pStyle w:val="ListBullet"/>
-      </w:pPr>
-      <w:r/>
-      <w:r>
-        <w:rPr>
-          <w:b/>
-        </w:rPr>
-        <w:t>Результат:</w:t>
-      </w:r>
-      <w:r>
-        <w:t xml:space="preserve"> более 300 человек прошли реабилитацию</w:t>
-      </w:r>
-    </w:p>
-    <w:p>
-      <w:pPr>
-        <w:pStyle w:val="Heading2"/>
-      </w:pPr>
-      <w:r>
-        <w:t>III. СВОДНАЯ ТАБЛИЦА ПО КАТЕГОРИЯМ</w:t>
+        <w:t>III. СВОДНАЯ ТАБЛИЦА КЛЮЧЕВЫХ ДОКУМЕНТОВ</w:t>
       </w:r>
     </w:p>
     <w:tbl>
@@ -1371,15 +769,16 @@
         <w:tblLook w:firstColumn="1" w:firstRow="1" w:lastColumn="0" w:lastRow="0" w:noHBand="0" w:noVBand="1" w:val="04A0"/>
       </w:tblPr>
       <w:tblGrid>
-        <w:gridCol w:w="2422"/>
-        <w:gridCol w:w="2422"/>
-        <w:gridCol w:w="2422"/>
-        <w:gridCol w:w="2422"/>
+        <w:gridCol w:w="1938"/>
+        <w:gridCol w:w="1938"/>
+        <w:gridCol w:w="1938"/>
+        <w:gridCol w:w="1938"/>
+        <w:gridCol w:w="1938"/>
       </w:tblGrid>
       <w:tr>
         <w:tc>
           <w:tcPr>
-            <w:tcW w:type="dxa" w:w="2422"/>
+            <w:tcW w:type="dxa" w:w="1938"/>
           </w:tcPr>
           <w:p>
             <w:r>
@@ -1387,13 +786,13 @@
                 <w:b/>
                 <w:sz w:val="20"/>
               </w:rPr>
-              <w:t>Категория</w:t>
+              <w:t>№</w:t>
             </w:r>
           </w:p>
         </w:tc>
         <w:tc>
           <w:tcPr>
-            <w:tcW w:type="dxa" w:w="2422"/>
+            <w:tcW w:type="dxa" w:w="1938"/>
           </w:tcPr>
           <w:p>
             <w:r>
@@ -1401,13 +800,13 @@
                 <w:b/>
                 <w:sz w:val="20"/>
               </w:rPr>
-              <w:t>Мера</w:t>
+              <w:t>Документ/Событие</w:t>
             </w:r>
           </w:p>
         </w:tc>
         <w:tc>
           <w:tcPr>
-            <w:tcW w:type="dxa" w:w="2422"/>
+            <w:tcW w:type="dxa" w:w="1938"/>
           </w:tcPr>
           <w:p>
             <w:r>
@@ -1415,13 +814,13 @@
                 <w:b/>
                 <w:sz w:val="20"/>
               </w:rPr>
-              <w:t>Статус</w:t>
+              <w:t>Уровень</w:t>
             </w:r>
           </w:p>
         </w:tc>
         <w:tc>
           <w:tcPr>
-            <w:tcW w:type="dxa" w:w="2422"/>
+            <w:tcW w:type="dxa" w:w="1938"/>
           </w:tcPr>
           <w:p>
             <w:r>
@@ -1433,57 +832,17 @@
             </w:r>
           </w:p>
         </w:tc>
-      </w:tr>
-      <w:tr>
         <w:tc>
           <w:tcPr>
-            <w:tcW w:type="dxa" w:w="2422"/>
+            <w:tcW w:type="dxa" w:w="1938"/>
           </w:tcPr>
           <w:p>
             <w:r>
               <w:rPr>
+                <w:b/>
                 <w:sz w:val="20"/>
               </w:rPr>
-              <w:t>**Инвалиды**</w:t>
-            </w:r>
-          </w:p>
-        </w:tc>
-        <w:tc>
-          <w:tcPr>
-            <w:tcW w:type="dxa" w:w="2422"/>
-          </w:tcPr>
-          <w:p>
-            <w:r>
-              <w:rPr>
-                <w:sz w:val="20"/>
-              </w:rPr>
-              <w:t>Повышение штрафа за незаконный знак «Инвалид» до 7 500 / 25 000 руб.</w:t>
-            </w:r>
-          </w:p>
-        </w:tc>
-        <w:tc>
-          <w:tcPr>
-            <w:tcW w:type="dxa" w:w="2422"/>
-          </w:tcPr>
-          <w:p>
-            <w:r>
-              <w:rPr>
-                <w:sz w:val="20"/>
-              </w:rPr>
-              <w:t>Законопроект внесён</w:t>
-            </w:r>
-          </w:p>
-        </w:tc>
-        <w:tc>
-          <w:tcPr>
-            <w:tcW w:type="dxa" w:w="2422"/>
-          </w:tcPr>
-          <w:p>
-            <w:r>
-              <w:rPr>
-                <w:sz w:val="20"/>
-              </w:rPr>
-              <w:t>14.06.2026</w:t>
+              <w:t>Категории</w:t>
             </w:r>
           </w:p>
         </w:tc>
@@ -1491,53 +850,66 @@
       <w:tr>
         <w:tc>
           <w:tcPr>
-            <w:tcW w:type="dxa" w:w="2422"/>
+            <w:tcW w:type="dxa" w:w="1938"/>
           </w:tcPr>
           <w:p>
             <w:r>
               <w:rPr>
                 <w:sz w:val="20"/>
               </w:rPr>
-              <w:t>**Инвалиды**</w:t>
+              <w:t>1</w:t>
             </w:r>
           </w:p>
         </w:tc>
         <w:tc>
           <w:tcPr>
-            <w:tcW w:type="dxa" w:w="2422"/>
+            <w:tcW w:type="dxa" w:w="1938"/>
           </w:tcPr>
           <w:p>
             <w:r>
               <w:rPr>
                 <w:sz w:val="20"/>
               </w:rPr>
-              <w:t>Автоматическое назначение страховой пенсии (беззаявительный порядок)</w:t>
+              <w:t>Указ Президента о расширении категорий Фонда «Защитники Отечества»</w:t>
             </w:r>
           </w:p>
         </w:tc>
         <w:tc>
           <w:tcPr>
-            <w:tcW w:type="dxa" w:w="2422"/>
+            <w:tcW w:type="dxa" w:w="1938"/>
           </w:tcPr>
           <w:p>
             <w:r>
               <w:rPr>
                 <w:sz w:val="20"/>
               </w:rPr>
-              <w:t>Проект ФЗ, обсуждение до 25.06</w:t>
+              <w:t>Федеральный</w:t>
             </w:r>
           </w:p>
         </w:tc>
         <w:tc>
           <w:tcPr>
-            <w:tcW w:type="dxa" w:w="2422"/>
+            <w:tcW w:type="dxa" w:w="1938"/>
           </w:tcPr>
           <w:p>
             <w:r>
               <w:rPr>
                 <w:sz w:val="20"/>
               </w:rPr>
-              <w:t>10.06.2026</w:t>
+              <w:t>~16.06.2026</w:t>
+            </w:r>
+          </w:p>
+        </w:tc>
+        <w:tc>
+          <w:tcPr>
+            <w:tcW w:type="dxa" w:w="1938"/>
+          </w:tcPr>
+          <w:p>
+            <w:r>
+              <w:rPr>
+                <w:sz w:val="20"/>
+              </w:rPr>
+              <w:t>Ветераны СВО, действующие военнослужащие с инвалидностью, граждане с инвалидностью из приграничных территорий</w:t>
             </w:r>
           </w:p>
         </w:tc>
@@ -1545,53 +917,66 @@
       <w:tr>
         <w:tc>
           <w:tcPr>
-            <w:tcW w:type="dxa" w:w="2422"/>
+            <w:tcW w:type="dxa" w:w="1938"/>
           </w:tcPr>
           <w:p>
             <w:r>
               <w:rPr>
                 <w:sz w:val="20"/>
               </w:rPr>
-              <w:t>**Участники СВО / военные**</w:t>
+              <w:t>2</w:t>
             </w:r>
           </w:p>
         </w:tc>
         <w:tc>
           <w:tcPr>
-            <w:tcW w:type="dxa" w:w="2422"/>
+            <w:tcW w:type="dxa" w:w="1938"/>
           </w:tcPr>
           <w:p>
             <w:r>
               <w:rPr>
                 <w:sz w:val="20"/>
               </w:rPr>
-              <w:t>Обязательная геномная регистрация</w:t>
+              <w:t>Поправки СФ о защите иностранных граждан — участников СВО от депортации</w:t>
             </w:r>
           </w:p>
         </w:tc>
         <w:tc>
           <w:tcPr>
-            <w:tcW w:type="dxa" w:w="2422"/>
+            <w:tcW w:type="dxa" w:w="1938"/>
           </w:tcPr>
           <w:p>
             <w:r>
               <w:rPr>
                 <w:sz w:val="20"/>
               </w:rPr>
-              <w:t>Закон вступил в силу</w:t>
+              <w:t>Федеральный</w:t>
             </w:r>
           </w:p>
         </w:tc>
         <w:tc>
           <w:tcPr>
-            <w:tcW w:type="dxa" w:w="2422"/>
+            <w:tcW w:type="dxa" w:w="1938"/>
           </w:tcPr>
           <w:p>
             <w:r>
               <w:rPr>
                 <w:sz w:val="20"/>
               </w:rPr>
-              <w:t>07.06.2026</w:t>
+              <w:t>~17-20.06.2026</w:t>
+            </w:r>
+          </w:p>
+        </w:tc>
+        <w:tc>
+          <w:tcPr>
+            <w:tcW w:type="dxa" w:w="1938"/>
+          </w:tcPr>
+          <w:p>
+            <w:r>
+              <w:rPr>
+                <w:sz w:val="20"/>
+              </w:rPr>
+              <w:t>Участники СВО — иностранные граждане и лица без гражданства</w:t>
             </w:r>
           </w:p>
         </w:tc>
@@ -1599,53 +984,66 @@
       <w:tr>
         <w:tc>
           <w:tcPr>
-            <w:tcW w:type="dxa" w:w="2422"/>
+            <w:tcW w:type="dxa" w:w="1938"/>
           </w:tcPr>
           <w:p>
             <w:r>
               <w:rPr>
                 <w:sz w:val="20"/>
               </w:rPr>
-              <w:t>**Участники СВО / военные**</w:t>
+              <w:t>3</w:t>
             </w:r>
           </w:p>
         </w:tc>
         <w:tc>
           <w:tcPr>
-            <w:tcW w:type="dxa" w:w="2422"/>
+            <w:tcW w:type="dxa" w:w="1938"/>
           </w:tcPr>
           <w:p>
             <w:r>
               <w:rPr>
                 <w:sz w:val="20"/>
               </w:rPr>
-              <w:t>Геномная регистрация для гражданского персонала</w:t>
+              <w:t>171 закон в поддержку СВО (заявление Володина)</w:t>
             </w:r>
           </w:p>
         </w:tc>
         <w:tc>
           <w:tcPr>
-            <w:tcW w:type="dxa" w:w="2422"/>
+            <w:tcW w:type="dxa" w:w="1938"/>
           </w:tcPr>
           <w:p>
             <w:r>
               <w:rPr>
                 <w:sz w:val="20"/>
               </w:rPr>
-              <w:t>Постановление вступило в силу</w:t>
+              <w:t>Федеральный</w:t>
             </w:r>
           </w:p>
         </w:tc>
         <w:tc>
           <w:tcPr>
-            <w:tcW w:type="dxa" w:w="2422"/>
+            <w:tcW w:type="dxa" w:w="1938"/>
           </w:tcPr>
           <w:p>
             <w:r>
               <w:rPr>
                 <w:sz w:val="20"/>
               </w:rPr>
-              <w:t>09.06.2026</w:t>
+              <w:t>~16-19.06.2026</w:t>
+            </w:r>
+          </w:p>
+        </w:tc>
+        <w:tc>
+          <w:tcPr>
+            <w:tcW w:type="dxa" w:w="1938"/>
+          </w:tcPr>
+          <w:p>
+            <w:r>
+              <w:rPr>
+                <w:sz w:val="20"/>
+              </w:rPr>
+              <w:t>Все категории участников СВО</w:t>
             </w:r>
           </w:p>
         </w:tc>
@@ -1653,53 +1051,66 @@
       <w:tr>
         <w:tc>
           <w:tcPr>
-            <w:tcW w:type="dxa" w:w="2422"/>
+            <w:tcW w:type="dxa" w:w="1938"/>
           </w:tcPr>
           <w:p>
             <w:r>
               <w:rPr>
                 <w:sz w:val="20"/>
               </w:rPr>
-              <w:t>**Дети Героев России**</w:t>
+              <w:t>4</w:t>
             </w:r>
           </w:p>
         </w:tc>
         <w:tc>
           <w:tcPr>
-            <w:tcW w:type="dxa" w:w="2422"/>
+            <w:tcW w:type="dxa" w:w="1938"/>
           </w:tcPr>
           <w:p>
             <w:r>
               <w:rPr>
                 <w:sz w:val="20"/>
               </w:rPr>
-              <w:t>Первоочередной приём в школы и детские сады</w:t>
+              <w:t>Продление документов об инвалидности для новых субъектов (СФР)</w:t>
             </w:r>
           </w:p>
         </w:tc>
         <w:tc>
           <w:tcPr>
-            <w:tcW w:type="dxa" w:w="2422"/>
+            <w:tcW w:type="dxa" w:w="1938"/>
           </w:tcPr>
           <w:p>
             <w:r>
               <w:rPr>
                 <w:sz w:val="20"/>
               </w:rPr>
-              <w:t>I чтение в ГД</w:t>
+              <w:t>Федеральный</w:t>
             </w:r>
           </w:p>
         </w:tc>
         <w:tc>
           <w:tcPr>
-            <w:tcW w:type="dxa" w:w="2422"/>
+            <w:tcW w:type="dxa" w:w="1938"/>
           </w:tcPr>
           <w:p>
             <w:r>
               <w:rPr>
                 <w:sz w:val="20"/>
               </w:rPr>
-              <w:t>10.06.2026</w:t>
+              <w:t>21.06.2026</w:t>
+            </w:r>
+          </w:p>
+        </w:tc>
+        <w:tc>
+          <w:tcPr>
+            <w:tcW w:type="dxa" w:w="1938"/>
+          </w:tcPr>
+          <w:p>
+            <w:r>
+              <w:rPr>
+                <w:sz w:val="20"/>
+              </w:rPr>
+              <w:t>Лица с инвалидностью из ДНР, ЛНР, Запорожской, Херсонской обл., Украины</w:t>
             </w:r>
           </w:p>
         </w:tc>
@@ -1707,53 +1118,66 @@
       <w:tr>
         <w:tc>
           <w:tcPr>
-            <w:tcW w:type="dxa" w:w="2422"/>
+            <w:tcW w:type="dxa" w:w="1938"/>
           </w:tcPr>
           <w:p>
             <w:r>
               <w:rPr>
                 <w:sz w:val="20"/>
               </w:rPr>
-              <w:t>**Ветераны СВО (фермеры)**</w:t>
+              <w:t>5</w:t>
             </w:r>
           </w:p>
         </w:tc>
         <w:tc>
           <w:tcPr>
-            <w:tcW w:type="dxa" w:w="2422"/>
+            <w:tcW w:type="dxa" w:w="1938"/>
           </w:tcPr>
           <w:p>
             <w:r>
               <w:rPr>
                 <w:sz w:val="20"/>
               </w:rPr>
-              <w:t>Бесплатное техприсоединение к электросетям</w:t>
+              <w:t>28 мер поддержки ветеранов СВО и семей (СФР)</w:t>
             </w:r>
           </w:p>
         </w:tc>
         <w:tc>
           <w:tcPr>
-            <w:tcW w:type="dxa" w:w="2422"/>
+            <w:tcW w:type="dxa" w:w="1938"/>
           </w:tcPr>
           <w:p>
             <w:r>
               <w:rPr>
                 <w:sz w:val="20"/>
               </w:rPr>
-              <w:t>Обращение в Минэнерго</w:t>
+              <w:t>Федеральный</w:t>
             </w:r>
           </w:p>
         </w:tc>
         <w:tc>
           <w:tcPr>
-            <w:tcW w:type="dxa" w:w="2422"/>
+            <w:tcW w:type="dxa" w:w="1938"/>
           </w:tcPr>
           <w:p>
             <w:r>
               <w:rPr>
                 <w:sz w:val="20"/>
               </w:rPr>
-              <w:t>июнь 2026</w:t>
+              <w:t>~18-20.06.2026</w:t>
+            </w:r>
+          </w:p>
+        </w:tc>
+        <w:tc>
+          <w:tcPr>
+            <w:tcW w:type="dxa" w:w="1938"/>
+          </w:tcPr>
+          <w:p>
+            <w:r>
+              <w:rPr>
+                <w:sz w:val="20"/>
+              </w:rPr>
+              <w:t>Ветераны СВО, члены семей</w:t>
             </w:r>
           </w:p>
         </w:tc>
@@ -1761,53 +1185,66 @@
       <w:tr>
         <w:tc>
           <w:tcPr>
-            <w:tcW w:type="dxa" w:w="2422"/>
+            <w:tcW w:type="dxa" w:w="1938"/>
           </w:tcPr>
           <w:p>
             <w:r>
               <w:rPr>
                 <w:sz w:val="20"/>
               </w:rPr>
-              <w:t>**Ветераны СВО / семьи**</w:t>
+              <w:t>6</w:t>
             </w:r>
           </w:p>
         </w:tc>
         <w:tc>
           <w:tcPr>
-            <w:tcW w:type="dxa" w:w="2422"/>
+            <w:tcW w:type="dxa" w:w="1938"/>
           </w:tcPr>
           <w:p>
             <w:r>
               <w:rPr>
                 <w:sz w:val="20"/>
               </w:rPr>
-              <w:t>Центры духовно-психологической реабилитации</w:t>
+              <w:t>350 тыс. руб. на бизнес безработным ветеранам СВО (СПб, 1 чтение)</w:t>
             </w:r>
           </w:p>
         </w:tc>
         <w:tc>
           <w:tcPr>
-            <w:tcW w:type="dxa" w:w="2422"/>
+            <w:tcW w:type="dxa" w:w="1938"/>
           </w:tcPr>
           <w:p>
             <w:r>
               <w:rPr>
                 <w:sz w:val="20"/>
               </w:rPr>
-              <w:t>Действуют / открываются</w:t>
+              <w:t>Региональный</w:t>
             </w:r>
           </w:p>
         </w:tc>
         <w:tc>
           <w:tcPr>
-            <w:tcW w:type="dxa" w:w="2422"/>
+            <w:tcW w:type="dxa" w:w="1938"/>
           </w:tcPr>
           <w:p>
             <w:r>
               <w:rPr>
                 <w:sz w:val="20"/>
               </w:rPr>
-              <w:t>05.06.2026</w:t>
+              <w:t>~16-19.06.2026</w:t>
+            </w:r>
+          </w:p>
+        </w:tc>
+        <w:tc>
+          <w:tcPr>
+            <w:tcW w:type="dxa" w:w="1938"/>
+          </w:tcPr>
+          <w:p>
+            <w:r>
+              <w:rPr>
+                <w:sz w:val="20"/>
+              </w:rPr>
+              <w:t>Безработные участники СВО, супруги с инвалидностью I-II гр.</w:t>
             </w:r>
           </w:p>
         </w:tc>
@@ -1815,53 +1252,66 @@
       <w:tr>
         <w:tc>
           <w:tcPr>
-            <w:tcW w:type="dxa" w:w="2422"/>
+            <w:tcW w:type="dxa" w:w="1938"/>
           </w:tcPr>
           <w:p>
             <w:r>
               <w:rPr>
                 <w:sz w:val="20"/>
               </w:rPr>
-              <w:t>**Семьи с детьми**</w:t>
+              <w:t>7</w:t>
             </w:r>
           </w:p>
         </w:tc>
         <w:tc>
           <w:tcPr>
-            <w:tcW w:type="dxa" w:w="2422"/>
+            <w:tcW w:type="dxa" w:w="1938"/>
           </w:tcPr>
           <w:p>
             <w:r>
               <w:rPr>
                 <w:sz w:val="20"/>
               </w:rPr>
-              <w:t>Единые требования к авиаперевозкам для семей</w:t>
+              <w:t>Кластер реабилитации во Всеволожске (ЛО)</w:t>
             </w:r>
           </w:p>
         </w:tc>
         <w:tc>
           <w:tcPr>
-            <w:tcW w:type="dxa" w:w="2422"/>
+            <w:tcW w:type="dxa" w:w="1938"/>
           </w:tcPr>
           <w:p>
             <w:r>
               <w:rPr>
                 <w:sz w:val="20"/>
               </w:rPr>
-              <w:t>Обсуждение в СФ</w:t>
+              <w:t>Региональный</w:t>
             </w:r>
           </w:p>
         </w:tc>
         <w:tc>
           <w:tcPr>
-            <w:tcW w:type="dxa" w:w="2422"/>
+            <w:tcW w:type="dxa" w:w="1938"/>
           </w:tcPr>
           <w:p>
             <w:r>
               <w:rPr>
                 <w:sz w:val="20"/>
               </w:rPr>
-              <w:t>01-10.06.2026</w:t>
+              <w:t>18.06.2026</w:t>
+            </w:r>
+          </w:p>
+        </w:tc>
+        <w:tc>
+          <w:tcPr>
+            <w:tcW w:type="dxa" w:w="1938"/>
+          </w:tcPr>
+          <w:p>
+            <w:r>
+              <w:rPr>
+                <w:sz w:val="20"/>
+              </w:rPr>
+              <w:t>Участники СВО, ветераны</w:t>
             </w:r>
           </w:p>
         </w:tc>
@@ -1869,91 +1319,13 @@
     </w:tbl>
     <w:p/>
     <w:p>
-      <w:pPr>
-        <w:pStyle w:val="Heading2"/>
-      </w:pPr>
       <w:r>
-        <w:t>IV. КЛЮЧЕВЫЕ ВЫВОДЫ</w:t>
-      </w:r>
-    </w:p>
-    <w:p>
-      <w:pPr>
-        <w:pStyle w:val="ListNumber"/>
-      </w:pPr>
-      <w:r/>
-      <w:r>
-        <w:rPr>
-          <w:b/>
-        </w:rPr>
-        <w:t>Геномная регистрация</w:t>
-      </w:r>
-      <w:r>
-        <w:t xml:space="preserve"> — самое значимое событие периода: закон № 52-ФЗ вступил в силу 7 июня. С 9 июня дополнен постановлением Правительства, распространяющим норму на гражданский персонал. Это системное изменение в идентификации участников боевых действий.</w:t>
-      </w:r>
-    </w:p>
-    <w:p>
-      <w:pPr>
-        <w:pStyle w:val="ListNumber"/>
-      </w:pPr>
-      <w:r/>
-      <w:r>
-        <w:rPr>
-          <w:b/>
-        </w:rPr>
-        <w:t>Льготы детям Героев</w:t>
-      </w:r>
-      <w:r>
-        <w:t xml:space="preserve"> — законопроект (I чтение 10 июня) устраняет давний пробел: дети Героев России и полных кавалеров ордена Славы получают приоритет при зачислении в школы и детские сады. При гибели Героя — внеочередной приём.</w:t>
-      </w:r>
-    </w:p>
-    <w:p>
-      <w:pPr>
-        <w:pStyle w:val="ListNumber"/>
-      </w:pPr>
-      <w:r/>
-      <w:r>
-        <w:rPr>
-          <w:b/>
-        </w:rPr>
-        <w:t>Защита прав инвалидов</w:t>
-      </w:r>
-      <w:r>
-        <w:t xml:space="preserve"> — две параллельные инициативы: (а) ужесточение наказания за незаконную парковку по знаку «Инвалид» (штрафы до 25 тыс. руб. за повторное нарушение); (б) переход на беззаявительное назначение страховых пенсий (обсуждение до 25 июня).</w:t>
-      </w:r>
-    </w:p>
-    <w:p>
-      <w:pPr>
-        <w:pStyle w:val="ListNumber"/>
-      </w:pPr>
-      <w:r/>
-      <w:r>
-        <w:rPr>
-          <w:b/>
-        </w:rPr>
-        <w:t>Экономическая поддержка ветеранов СВО</w:t>
-      </w:r>
-      <w:r>
-        <w:t xml:space="preserve"> — остро стоит вопрос тарифов на электроэнергию для фермеров-участников СВО. Предлагается бесплатное техприсоединение и спецтариф 1–2 руб./кВт·ч. Решение находится на стадии рассмотрения в Минэнерго.</w:t>
-      </w:r>
-    </w:p>
-    <w:p>
-      <w:pPr>
-        <w:pStyle w:val="ListNumber"/>
-      </w:pPr>
-      <w:r/>
-      <w:r>
-        <w:rPr>
-          <w:b/>
-        </w:rPr>
-        <w:t>Реабилитация и ресоциализация</w:t>
-      </w:r>
-      <w:r>
-        <w:t xml:space="preserve"> — фонд «Защитники Отечества» системно развивает сеть центров духовно-психологической реабилитации. К концу 2026 года будет 3 действующих центра (Псково-Печерский, Херсонес, Самарская область), в 2027 — Ростов Великий.</w:t>
+        <w:t>*Отчёт подготовлен 21 июня 2026 г. на основе данных поисковых запросов через SearXNG.*</w:t>
       </w:r>
     </w:p>
     <w:p>
       <w:r>
-        <w:t>*Отчёт составлен 15 июня 2026 года на основе данных официальных источников: Парламентская газета (официальное издание Федерального Собрания РФ), портал проектов НПА regulation.gov.ru.*</w:t>
+        <w:t>*Источники: council.gov.ru, duma.gov.ru, sfr.gov.ru, ptzgovorit.ru, argumenti.ru, kirfakel.ru, региональные СМИ.*</w:t>
       </w:r>
     </w:p>
     <w:sectPr>

</xml_diff>